<commit_message>
design doc updated, sprint report1 doc initiated
</commit_message>
<xml_diff>
--- a/srDesign_Design.docx
+++ b/srDesign_Design.docx
@@ -111,17 +111,8 @@
           <w:rStyle w:val="IntenseEmphasis"/>
           <w:i/>
         </w:rPr>
-        <w:t xml:space="preserve">David </w:t>
+        <w:t>David Jarman</w:t>
       </w:r>
-      <w:proofErr w:type="spellStart"/>
-      <w:r>
-        <w:rPr>
-          <w:rStyle w:val="IntenseEmphasis"/>
-          <w:i/>
-        </w:rPr>
-        <w:t>Jarman</w:t>
-      </w:r>
-      <w:proofErr w:type="spellEnd"/>
     </w:p>
     <w:p>
       <w:pPr>
@@ -138,17 +129,8 @@
           <w:rStyle w:val="IntenseEmphasis"/>
           <w:i/>
         </w:rPr>
-        <w:t xml:space="preserve">Kevin </w:t>
+        <w:t>Kevin Worner</w:t>
       </w:r>
-      <w:proofErr w:type="spellStart"/>
-      <w:r>
-        <w:rPr>
-          <w:rStyle w:val="IntenseEmphasis"/>
-          <w:i/>
-        </w:rPr>
-        <w:t>Worner</w:t>
-      </w:r>
-      <w:proofErr w:type="spellEnd"/>
     </w:p>
     <w:p>
       <w:pPr>
@@ -460,8 +442,279 @@
         </w:rPr>
       </w:pPr>
     </w:p>
+    <w:p>
+      <w:pPr>
+        <w:autoSpaceDE w:val="0"/>
+        <w:autoSpaceDN w:val="0"/>
+        <w:adjustRightInd w:val="0"/>
+        <w:spacing w:after="0" w:line="240" w:lineRule="auto"/>
+        <w:rPr>
+          <w:rFonts w:ascii="CMSS12" w:hAnsi="CMSS12" w:cs="CMSS12"/>
+          <w:color w:val="F7CE03"/>
+          <w:sz w:val="29"/>
+          <w:szCs w:val="29"/>
+        </w:rPr>
+      </w:pPr>
+    </w:p>
+    <w:p>
+      <w:pPr>
+        <w:autoSpaceDE w:val="0"/>
+        <w:autoSpaceDN w:val="0"/>
+        <w:adjustRightInd w:val="0"/>
+        <w:spacing w:after="0" w:line="240" w:lineRule="auto"/>
+        <w:rPr>
+          <w:rFonts w:ascii="CMSS12" w:hAnsi="CMSS12" w:cs="CMSS12"/>
+          <w:color w:val="F7CE03"/>
+          <w:sz w:val="29"/>
+          <w:szCs w:val="29"/>
+        </w:rPr>
+      </w:pPr>
+    </w:p>
+    <w:p>
+      <w:pPr>
+        <w:pStyle w:val="Heading1"/>
+      </w:pPr>
+      <w:r>
+        <w:lastRenderedPageBreak/>
+        <w:t>Revision History</w:t>
+      </w:r>
+    </w:p>
+    <w:tbl>
+      <w:tblPr>
+        <w:tblStyle w:val="LightList-Accent1"/>
+        <w:tblW w:w="0" w:type="auto"/>
+        <w:tblLook w:val="04A0" w:firstRow="1" w:lastRow="0" w:firstColumn="1" w:lastColumn="0" w:noHBand="0" w:noVBand="1"/>
+      </w:tblPr>
+      <w:tblGrid>
+        <w:gridCol w:w="2394"/>
+        <w:gridCol w:w="2394"/>
+        <w:gridCol w:w="2394"/>
+        <w:gridCol w:w="2394"/>
+      </w:tblGrid>
+      <w:tr>
+        <w:trPr>
+          <w:cnfStyle w:val="100000000000" w:firstRow="1" w:lastRow="0" w:firstColumn="0" w:lastColumn="0" w:oddVBand="0" w:evenVBand="0" w:oddHBand="0" w:evenHBand="0" w:firstRowFirstColumn="0" w:firstRowLastColumn="0" w:lastRowFirstColumn="0" w:lastRowLastColumn="0"/>
+        </w:trPr>
+        <w:tc>
+          <w:tcPr>
+            <w:cnfStyle w:val="001000000000" w:firstRow="0" w:lastRow="0" w:firstColumn="1" w:lastColumn="0" w:oddVBand="0" w:evenVBand="0" w:oddHBand="0" w:evenHBand="0" w:firstRowFirstColumn="0" w:firstRowLastColumn="0" w:lastRowFirstColumn="0" w:lastRowLastColumn="0"/>
+            <w:tcW w:w="2394" w:type="dxa"/>
+          </w:tcPr>
+          <w:p>
+            <w:r>
+              <w:t>Date</w:t>
+            </w:r>
+          </w:p>
+        </w:tc>
+        <w:tc>
+          <w:tcPr>
+            <w:tcW w:w="2394" w:type="dxa"/>
+          </w:tcPr>
+          <w:p>
+            <w:pPr>
+              <w:cnfStyle w:val="100000000000" w:firstRow="1" w:lastRow="0" w:firstColumn="0" w:lastColumn="0" w:oddVBand="0" w:evenVBand="0" w:oddHBand="0" w:evenHBand="0" w:firstRowFirstColumn="0" w:firstRowLastColumn="0" w:lastRowFirstColumn="0" w:lastRowLastColumn="0"/>
+            </w:pPr>
+            <w:r>
+              <w:t>Author</w:t>
+            </w:r>
+          </w:p>
+        </w:tc>
+        <w:tc>
+          <w:tcPr>
+            <w:tcW w:w="2394" w:type="dxa"/>
+          </w:tcPr>
+          <w:p>
+            <w:pPr>
+              <w:cnfStyle w:val="100000000000" w:firstRow="1" w:lastRow="0" w:firstColumn="0" w:lastColumn="0" w:oddVBand="0" w:evenVBand="0" w:oddHBand="0" w:evenHBand="0" w:firstRowFirstColumn="0" w:firstRowLastColumn="0" w:lastRowFirstColumn="0" w:lastRowLastColumn="0"/>
+            </w:pPr>
+            <w:r>
+              <w:t>Version</w:t>
+            </w:r>
+          </w:p>
+        </w:tc>
+        <w:tc>
+          <w:tcPr>
+            <w:tcW w:w="2394" w:type="dxa"/>
+          </w:tcPr>
+          <w:p>
+            <w:pPr>
+              <w:cnfStyle w:val="100000000000" w:firstRow="1" w:lastRow="0" w:firstColumn="0" w:lastColumn="0" w:oddVBand="0" w:evenVBand="0" w:oddHBand="0" w:evenHBand="0" w:firstRowFirstColumn="0" w:firstRowLastColumn="0" w:lastRowFirstColumn="0" w:lastRowLastColumn="0"/>
+            </w:pPr>
+            <w:r>
+              <w:t>Comments</w:t>
+            </w:r>
+          </w:p>
+        </w:tc>
+      </w:tr>
+      <w:tr>
+        <w:trPr>
+          <w:cnfStyle w:val="000000100000" w:firstRow="0" w:lastRow="0" w:firstColumn="0" w:lastColumn="0" w:oddVBand="0" w:evenVBand="0" w:oddHBand="1" w:evenHBand="0" w:firstRowFirstColumn="0" w:firstRowLastColumn="0" w:lastRowFirstColumn="0" w:lastRowLastColumn="0"/>
+        </w:trPr>
+        <w:tc>
+          <w:tcPr>
+            <w:cnfStyle w:val="001000000000" w:firstRow="0" w:lastRow="0" w:firstColumn="1" w:lastColumn="0" w:oddVBand="0" w:evenVBand="0" w:oddHBand="0" w:evenHBand="0" w:firstRowFirstColumn="0" w:firstRowLastColumn="0" w:lastRowFirstColumn="0" w:lastRowLastColumn="0"/>
+            <w:tcW w:w="2394" w:type="dxa"/>
+          </w:tcPr>
+          <w:p>
+            <w:r>
+              <w:t>10/1/2012</w:t>
+            </w:r>
+          </w:p>
+        </w:tc>
+        <w:tc>
+          <w:tcPr>
+            <w:tcW w:w="2394" w:type="dxa"/>
+          </w:tcPr>
+          <w:p>
+            <w:pPr>
+              <w:cnfStyle w:val="000000100000" w:firstRow="0" w:lastRow="0" w:firstColumn="0" w:lastColumn="0" w:oddVBand="0" w:evenVBand="0" w:oddHBand="1" w:evenHBand="0" w:firstRowFirstColumn="0" w:firstRowLastColumn="0" w:lastRowFirstColumn="0" w:lastRowLastColumn="0"/>
+            </w:pPr>
+            <w:r>
+              <w:t>Marshall Gaucher</w:t>
+            </w:r>
+          </w:p>
+        </w:tc>
+        <w:tc>
+          <w:tcPr>
+            <w:tcW w:w="2394" w:type="dxa"/>
+          </w:tcPr>
+          <w:p>
+            <w:pPr>
+              <w:cnfStyle w:val="000000100000" w:firstRow="0" w:lastRow="0" w:firstColumn="0" w:lastColumn="0" w:oddVBand="0" w:evenVBand="0" w:oddHBand="1" w:evenHBand="0" w:firstRowFirstColumn="0" w:firstRowLastColumn="0" w:lastRowFirstColumn="0" w:lastRowLastColumn="0"/>
+            </w:pPr>
+            <w:r>
+              <w:t>1.0.0</w:t>
+            </w:r>
+          </w:p>
+        </w:tc>
+        <w:tc>
+          <w:tcPr>
+            <w:tcW w:w="2394" w:type="dxa"/>
+          </w:tcPr>
+          <w:p>
+            <w:pPr>
+              <w:cnfStyle w:val="000000100000" w:firstRow="0" w:lastRow="0" w:firstColumn="0" w:lastColumn="0" w:oddVBand="0" w:evenVBand="0" w:oddHBand="1" w:evenHBand="0" w:firstRowFirstColumn="0" w:firstRowLastColumn="0" w:lastRowFirstColumn="0" w:lastRowLastColumn="0"/>
+            </w:pPr>
+            <w:r>
+              <w:t>Initial Version</w:t>
+            </w:r>
+          </w:p>
+        </w:tc>
+      </w:tr>
+      <w:tr>
+        <w:tc>
+          <w:tcPr>
+            <w:cnfStyle w:val="001000000000" w:firstRow="0" w:lastRow="0" w:firstColumn="1" w:lastColumn="0" w:oddVBand="0" w:evenVBand="0" w:oddHBand="0" w:evenHBand="0" w:firstRowFirstColumn="0" w:firstRowLastColumn="0" w:lastRowFirstColumn="0" w:lastRowLastColumn="0"/>
+            <w:tcW w:w="2394" w:type="dxa"/>
+          </w:tcPr>
+          <w:p/>
+        </w:tc>
+        <w:tc>
+          <w:tcPr>
+            <w:tcW w:w="2394" w:type="dxa"/>
+          </w:tcPr>
+          <w:p>
+            <w:pPr>
+              <w:cnfStyle w:val="000000000000" w:firstRow="0" w:lastRow="0" w:firstColumn="0" w:lastColumn="0" w:oddVBand="0" w:evenVBand="0" w:oddHBand="0" w:evenHBand="0" w:firstRowFirstColumn="0" w:firstRowLastColumn="0" w:lastRowFirstColumn="0" w:lastRowLastColumn="0"/>
+            </w:pPr>
+          </w:p>
+        </w:tc>
+        <w:tc>
+          <w:tcPr>
+            <w:tcW w:w="2394" w:type="dxa"/>
+          </w:tcPr>
+          <w:p>
+            <w:pPr>
+              <w:cnfStyle w:val="000000000000" w:firstRow="0" w:lastRow="0" w:firstColumn="0" w:lastColumn="0" w:oddVBand="0" w:evenVBand="0" w:oddHBand="0" w:evenHBand="0" w:firstRowFirstColumn="0" w:firstRowLastColumn="0" w:lastRowFirstColumn="0" w:lastRowLastColumn="0"/>
+            </w:pPr>
+          </w:p>
+        </w:tc>
+        <w:tc>
+          <w:tcPr>
+            <w:tcW w:w="2394" w:type="dxa"/>
+          </w:tcPr>
+          <w:p>
+            <w:pPr>
+              <w:cnfStyle w:val="000000000000" w:firstRow="0" w:lastRow="0" w:firstColumn="0" w:lastColumn="0" w:oddVBand="0" w:evenVBand="0" w:oddHBand="0" w:evenHBand="0" w:firstRowFirstColumn="0" w:firstRowLastColumn="0" w:lastRowFirstColumn="0" w:lastRowLastColumn="0"/>
+            </w:pPr>
+          </w:p>
+        </w:tc>
+      </w:tr>
+      <w:tr>
+        <w:trPr>
+          <w:cnfStyle w:val="000000100000" w:firstRow="0" w:lastRow="0" w:firstColumn="0" w:lastColumn="0" w:oddVBand="0" w:evenVBand="0" w:oddHBand="1" w:evenHBand="0" w:firstRowFirstColumn="0" w:firstRowLastColumn="0" w:lastRowFirstColumn="0" w:lastRowLastColumn="0"/>
+        </w:trPr>
+        <w:tc>
+          <w:tcPr>
+            <w:cnfStyle w:val="001000000000" w:firstRow="0" w:lastRow="0" w:firstColumn="1" w:lastColumn="0" w:oddVBand="0" w:evenVBand="0" w:oddHBand="0" w:evenHBand="0" w:firstRowFirstColumn="0" w:firstRowLastColumn="0" w:lastRowFirstColumn="0" w:lastRowLastColumn="0"/>
+            <w:tcW w:w="2394" w:type="dxa"/>
+          </w:tcPr>
+          <w:p/>
+        </w:tc>
+        <w:tc>
+          <w:tcPr>
+            <w:tcW w:w="2394" w:type="dxa"/>
+          </w:tcPr>
+          <w:p>
+            <w:pPr>
+              <w:cnfStyle w:val="000000100000" w:firstRow="0" w:lastRow="0" w:firstColumn="0" w:lastColumn="0" w:oddVBand="0" w:evenVBand="0" w:oddHBand="1" w:evenHBand="0" w:firstRowFirstColumn="0" w:firstRowLastColumn="0" w:lastRowFirstColumn="0" w:lastRowLastColumn="0"/>
+            </w:pPr>
+          </w:p>
+        </w:tc>
+        <w:tc>
+          <w:tcPr>
+            <w:tcW w:w="2394" w:type="dxa"/>
+          </w:tcPr>
+          <w:p>
+            <w:pPr>
+              <w:cnfStyle w:val="000000100000" w:firstRow="0" w:lastRow="0" w:firstColumn="0" w:lastColumn="0" w:oddVBand="0" w:evenVBand="0" w:oddHBand="1" w:evenHBand="0" w:firstRowFirstColumn="0" w:firstRowLastColumn="0" w:lastRowFirstColumn="0" w:lastRowLastColumn="0"/>
+            </w:pPr>
+          </w:p>
+        </w:tc>
+        <w:tc>
+          <w:tcPr>
+            <w:tcW w:w="2394" w:type="dxa"/>
+          </w:tcPr>
+          <w:p>
+            <w:pPr>
+              <w:cnfStyle w:val="000000100000" w:firstRow="0" w:lastRow="0" w:firstColumn="0" w:lastColumn="0" w:oddVBand="0" w:evenVBand="0" w:oddHBand="1" w:evenHBand="0" w:firstRowFirstColumn="0" w:firstRowLastColumn="0" w:lastRowFirstColumn="0" w:lastRowLastColumn="0"/>
+            </w:pPr>
+          </w:p>
+        </w:tc>
+      </w:tr>
+    </w:tbl>
+    <w:p/>
+    <w:p/>
+    <w:p/>
+    <w:p/>
+    <w:p/>
+    <w:p/>
+    <w:p/>
+    <w:p/>
+    <w:p/>
+    <w:p/>
+    <w:p/>
+    <w:p/>
+    <w:p/>
+    <w:p/>
+    <w:p/>
+    <w:p/>
+    <w:p/>
+    <w:p/>
+    <w:p/>
+    <w:p/>
+    <w:p/>
     <w:sdt>
       <w:sdtPr>
+        <w:rPr>
+          <w:rFonts w:asciiTheme="minorHAnsi" w:eastAsiaTheme="minorHAnsi" w:hAnsiTheme="minorHAnsi" w:cstheme="minorBidi"/>
+          <w:b w:val="0"/>
+          <w:bCs w:val="0"/>
+          <w:color w:val="auto"/>
+          <w:sz w:val="22"/>
+          <w:szCs w:val="22"/>
+          <w:lang w:eastAsia="en-US"/>
+        </w:rPr>
         <w:id w:val="-736158025"/>
         <w:docPartObj>
           <w:docPartGallery w:val="Table of Contents"/>
@@ -470,12 +723,7 @@
       </w:sdtPr>
       <w:sdtEndPr>
         <w:rPr>
-          <w:rFonts w:asciiTheme="minorHAnsi" w:eastAsiaTheme="minorHAnsi" w:hAnsiTheme="minorHAnsi" w:cstheme="minorBidi"/>
           <w:noProof/>
-          <w:color w:val="auto"/>
-          <w:sz w:val="22"/>
-          <w:szCs w:val="22"/>
-          <w:lang w:eastAsia="en-US"/>
         </w:rPr>
       </w:sdtEndPr>
       <w:sdtContent>
@@ -5309,9 +5557,7 @@
       <w:r>
         <w:t>Phase Overview</w:t>
       </w:r>
-      <w:bookmarkStart w:id="27" w:name="_GoBack"/>
       <w:bookmarkEnd w:id="26"/>
-      <w:bookmarkEnd w:id="27"/>
     </w:p>
     <w:p>
       <w:pPr>
@@ -5321,11 +5567,11 @@
           <w:numId w:val="11"/>
         </w:numPr>
       </w:pPr>
-      <w:bookmarkStart w:id="28" w:name="_Toc335909912"/>
+      <w:bookmarkStart w:id="27" w:name="_Toc335909912"/>
       <w:r>
         <w:t>Architecture Diagram</w:t>
       </w:r>
-      <w:bookmarkEnd w:id="28"/>
+      <w:bookmarkEnd w:id="27"/>
     </w:p>
     <w:p>
       <w:pPr>
@@ -5335,13 +5581,12 @@
           <w:numId w:val="11"/>
         </w:numPr>
       </w:pPr>
-      <w:bookmarkStart w:id="29" w:name="_Toc335909913"/>
+      <w:bookmarkStart w:id="28" w:name="_Toc335909913"/>
       <w:r>
         <w:t>Data or Logic Flow Diagram</w:t>
       </w:r>
-      <w:bookmarkEnd w:id="29"/>
-    </w:p>
-    <w:p/>
+      <w:bookmarkEnd w:id="28"/>
+    </w:p>
     <w:p>
       <w:pPr>
         <w:pStyle w:val="Heading3"/>
@@ -5350,12 +5595,11 @@
           <w:numId w:val="11"/>
         </w:numPr>
       </w:pPr>
-      <w:bookmarkStart w:id="30" w:name="_Toc335909914"/>
+      <w:bookmarkStart w:id="29" w:name="_Toc335909914"/>
       <w:r>
-        <w:lastRenderedPageBreak/>
         <w:t>Design Details</w:t>
       </w:r>
-      <w:bookmarkEnd w:id="30"/>
+      <w:bookmarkEnd w:id="29"/>
     </w:p>
     <w:p>
       <w:pPr>
@@ -5365,11 +5609,11 @@
           <w:numId w:val="11"/>
         </w:numPr>
       </w:pPr>
-      <w:bookmarkStart w:id="31" w:name="_Toc335909915"/>
+      <w:bookmarkStart w:id="30" w:name="_Toc335909915"/>
       <w:r>
         <w:t>Major Component #3</w:t>
       </w:r>
-      <w:bookmarkEnd w:id="31"/>
+      <w:bookmarkEnd w:id="30"/>
     </w:p>
     <w:p>
       <w:pPr>
@@ -5379,11 +5623,11 @@
           <w:numId w:val="11"/>
         </w:numPr>
       </w:pPr>
-      <w:bookmarkStart w:id="32" w:name="_Toc335909916"/>
+      <w:bookmarkStart w:id="31" w:name="_Toc335909916"/>
       <w:r>
         <w:t>Technologies Used</w:t>
       </w:r>
-      <w:bookmarkEnd w:id="32"/>
+      <w:bookmarkEnd w:id="31"/>
     </w:p>
     <w:p>
       <w:pPr>
@@ -5393,11 +5637,11 @@
           <w:numId w:val="11"/>
         </w:numPr>
       </w:pPr>
-      <w:bookmarkStart w:id="33" w:name="_Toc335909917"/>
+      <w:bookmarkStart w:id="32" w:name="_Toc335909917"/>
       <w:r>
         <w:t>Component Overview</w:t>
       </w:r>
-      <w:bookmarkEnd w:id="33"/>
+      <w:bookmarkEnd w:id="32"/>
     </w:p>
     <w:p>
       <w:pPr>
@@ -5407,11 +5651,11 @@
           <w:numId w:val="11"/>
         </w:numPr>
       </w:pPr>
-      <w:bookmarkStart w:id="34" w:name="_Toc335909918"/>
+      <w:bookmarkStart w:id="33" w:name="_Toc335909918"/>
       <w:r>
         <w:t>Phase Overview</w:t>
       </w:r>
-      <w:bookmarkEnd w:id="34"/>
+      <w:bookmarkEnd w:id="33"/>
     </w:p>
     <w:p>
       <w:pPr>
@@ -5421,11 +5665,11 @@
           <w:numId w:val="11"/>
         </w:numPr>
       </w:pPr>
-      <w:bookmarkStart w:id="35" w:name="_Toc335909919"/>
+      <w:bookmarkStart w:id="34" w:name="_Toc335909919"/>
       <w:r>
         <w:t>Architecture Diagram</w:t>
       </w:r>
-      <w:bookmarkEnd w:id="35"/>
+      <w:bookmarkEnd w:id="34"/>
     </w:p>
     <w:p>
       <w:pPr>
@@ -5435,11 +5679,11 @@
           <w:numId w:val="11"/>
         </w:numPr>
       </w:pPr>
-      <w:bookmarkStart w:id="36" w:name="_Toc335909920"/>
+      <w:bookmarkStart w:id="35" w:name="_Toc335909920"/>
       <w:r>
         <w:t>Data Flow Diagram</w:t>
       </w:r>
-      <w:bookmarkEnd w:id="36"/>
+      <w:bookmarkEnd w:id="35"/>
       <w:r>
         <w:t xml:space="preserve"> </w:t>
       </w:r>
@@ -5452,11 +5696,11 @@
           <w:numId w:val="11"/>
         </w:numPr>
       </w:pPr>
-      <w:bookmarkStart w:id="37" w:name="_Toc335909921"/>
+      <w:bookmarkStart w:id="36" w:name="_Toc335909921"/>
       <w:r>
         <w:t>Design Details</w:t>
       </w:r>
-      <w:bookmarkEnd w:id="37"/>
+      <w:bookmarkEnd w:id="36"/>
     </w:p>
     <w:p>
       <w:pPr>
@@ -5466,11 +5710,11 @@
           <w:numId w:val="11"/>
         </w:numPr>
       </w:pPr>
-      <w:bookmarkStart w:id="38" w:name="_Toc335909922"/>
+      <w:bookmarkStart w:id="37" w:name="_Toc335909922"/>
       <w:r>
         <w:t>System and Unit Testing</w:t>
       </w:r>
-      <w:bookmarkEnd w:id="38"/>
+      <w:bookmarkEnd w:id="37"/>
     </w:p>
     <w:p>
       <w:pPr>
@@ -5480,11 +5724,11 @@
           <w:numId w:val="11"/>
         </w:numPr>
       </w:pPr>
-      <w:bookmarkStart w:id="39" w:name="_Toc335909923"/>
+      <w:bookmarkStart w:id="38" w:name="_Toc335909923"/>
       <w:r>
         <w:t>Overview</w:t>
       </w:r>
-      <w:bookmarkEnd w:id="39"/>
+      <w:bookmarkEnd w:id="38"/>
     </w:p>
     <w:p>
       <w:pPr>
@@ -5494,11 +5738,11 @@
           <w:numId w:val="11"/>
         </w:numPr>
       </w:pPr>
-      <w:bookmarkStart w:id="40" w:name="_Toc335909924"/>
+      <w:bookmarkStart w:id="39" w:name="_Toc335909924"/>
       <w:r>
         <w:t>Dependencies</w:t>
       </w:r>
-      <w:bookmarkEnd w:id="40"/>
+      <w:bookmarkEnd w:id="39"/>
     </w:p>
     <w:p>
       <w:pPr>
@@ -5508,11 +5752,11 @@
           <w:numId w:val="11"/>
         </w:numPr>
       </w:pPr>
-      <w:bookmarkStart w:id="41" w:name="_Toc335909925"/>
+      <w:bookmarkStart w:id="40" w:name="_Toc335909925"/>
       <w:r>
         <w:t>Test Setup and Execution</w:t>
       </w:r>
-      <w:bookmarkEnd w:id="41"/>
+      <w:bookmarkEnd w:id="40"/>
     </w:p>
     <w:p>
       <w:pPr>
@@ -5522,11 +5766,11 @@
           <w:numId w:val="11"/>
         </w:numPr>
       </w:pPr>
-      <w:bookmarkStart w:id="42" w:name="_Toc335909926"/>
+      <w:bookmarkStart w:id="41" w:name="_Toc335909926"/>
       <w:r>
         <w:t>Development Environment</w:t>
       </w:r>
-      <w:bookmarkEnd w:id="42"/>
+      <w:bookmarkEnd w:id="41"/>
     </w:p>
     <w:p>
       <w:pPr>
@@ -5536,11 +5780,11 @@
           <w:numId w:val="11"/>
         </w:numPr>
       </w:pPr>
-      <w:bookmarkStart w:id="43" w:name="_Toc335909927"/>
+      <w:bookmarkStart w:id="42" w:name="_Toc335909927"/>
       <w:r>
         <w:t>Development IDE and Tools</w:t>
       </w:r>
-      <w:bookmarkEnd w:id="43"/>
+      <w:bookmarkEnd w:id="42"/>
     </w:p>
     <w:p>
       <w:pPr>
@@ -5550,11 +5794,11 @@
           <w:numId w:val="11"/>
         </w:numPr>
       </w:pPr>
-      <w:bookmarkStart w:id="44" w:name="_Toc335909928"/>
+      <w:bookmarkStart w:id="43" w:name="_Toc335909928"/>
       <w:r>
         <w:t>Source Control</w:t>
       </w:r>
-      <w:bookmarkEnd w:id="44"/>
+      <w:bookmarkEnd w:id="43"/>
     </w:p>
     <w:p>
       <w:pPr>
@@ -5564,11 +5808,11 @@
           <w:numId w:val="11"/>
         </w:numPr>
       </w:pPr>
-      <w:bookmarkStart w:id="45" w:name="_Toc335909929"/>
+      <w:bookmarkStart w:id="44" w:name="_Toc335909929"/>
       <w:r>
         <w:t>Dependencies</w:t>
       </w:r>
-      <w:bookmarkEnd w:id="45"/>
+      <w:bookmarkEnd w:id="44"/>
     </w:p>
     <w:p>
       <w:pPr>
@@ -5578,11 +5822,11 @@
           <w:numId w:val="11"/>
         </w:numPr>
       </w:pPr>
-      <w:bookmarkStart w:id="46" w:name="_Toc335909930"/>
+      <w:bookmarkStart w:id="45" w:name="_Toc335909930"/>
       <w:r>
         <w:t>Build Environment</w:t>
       </w:r>
-      <w:bookmarkEnd w:id="46"/>
+      <w:bookmarkEnd w:id="45"/>
     </w:p>
     <w:p>
       <w:pPr>
@@ -5592,11 +5836,12 @@
           <w:numId w:val="11"/>
         </w:numPr>
       </w:pPr>
-      <w:bookmarkStart w:id="47" w:name="_Toc335909931"/>
+      <w:bookmarkStart w:id="46" w:name="_Toc335909931"/>
       <w:r>
+        <w:lastRenderedPageBreak/>
         <w:t>Development Machine Setup</w:t>
       </w:r>
-      <w:bookmarkEnd w:id="47"/>
+      <w:bookmarkEnd w:id="46"/>
     </w:p>
     <w:p>
       <w:pPr>
@@ -5606,11 +5851,11 @@
           <w:numId w:val="11"/>
         </w:numPr>
       </w:pPr>
-      <w:bookmarkStart w:id="48" w:name="_Toc335909932"/>
+      <w:bookmarkStart w:id="47" w:name="_Toc335909932"/>
       <w:r>
         <w:t>Release | Setup | Deployment</w:t>
       </w:r>
-      <w:bookmarkEnd w:id="48"/>
+      <w:bookmarkEnd w:id="47"/>
     </w:p>
     <w:p>
       <w:pPr>
@@ -5620,11 +5865,11 @@
           <w:numId w:val="11"/>
         </w:numPr>
       </w:pPr>
-      <w:bookmarkStart w:id="49" w:name="_Toc335909933"/>
+      <w:bookmarkStart w:id="48" w:name="_Toc335909933"/>
       <w:r>
         <w:t>Deployment Information and Dependencies</w:t>
       </w:r>
-      <w:bookmarkEnd w:id="49"/>
+      <w:bookmarkEnd w:id="48"/>
     </w:p>
     <w:p>
       <w:pPr>
@@ -5634,11 +5879,11 @@
           <w:numId w:val="11"/>
         </w:numPr>
       </w:pPr>
-      <w:bookmarkStart w:id="50" w:name="_Toc335909934"/>
+      <w:bookmarkStart w:id="49" w:name="_Toc335909934"/>
       <w:r>
         <w:t>Setup Information</w:t>
       </w:r>
-      <w:bookmarkEnd w:id="50"/>
+      <w:bookmarkEnd w:id="49"/>
     </w:p>
     <w:p>
       <w:pPr>
@@ -5648,11 +5893,11 @@
           <w:numId w:val="11"/>
         </w:numPr>
       </w:pPr>
-      <w:bookmarkStart w:id="51" w:name="_Toc335909935"/>
+      <w:bookmarkStart w:id="50" w:name="_Toc335909935"/>
       <w:r>
         <w:t>System Versioning Information</w:t>
       </w:r>
-      <w:bookmarkEnd w:id="51"/>
+      <w:bookmarkEnd w:id="50"/>
     </w:p>
     <w:p>
       <w:pPr>
@@ -5662,13 +5907,62 @@
           <w:numId w:val="11"/>
         </w:numPr>
       </w:pPr>
-      <w:bookmarkStart w:id="52" w:name="_Toc335909936"/>
+      <w:bookmarkStart w:id="51" w:name="_Toc335909936"/>
       <w:r>
-        <w:lastRenderedPageBreak/>
         <w:t>End User Documentation</w:t>
       </w:r>
+      <w:bookmarkEnd w:id="51"/>
+    </w:p>
+    <w:p/>
+    <w:p>
+      <w:pPr>
+        <w:pStyle w:val="Heading1"/>
+      </w:pPr>
+      <w:r>
+        <w:t>Appendix I: List of Figures</w:t>
+      </w:r>
+    </w:p>
+    <w:p/>
+    <w:p>
+      <w:pPr>
+        <w:pStyle w:val="Heading1"/>
+      </w:pPr>
+      <w:r>
+        <w:t>Appendix II: Supporting Information and Details</w:t>
+      </w:r>
+    </w:p>
+    <w:p>
+      <w:pPr>
+        <w:pStyle w:val="Heading1"/>
+      </w:pPr>
+      <w:r>
+        <w:t>Appendix III: Progress | Sprint Reports</w:t>
+      </w:r>
+    </w:p>
+    <w:p>
+      <w:pPr>
+        <w:pStyle w:val="Heading2"/>
+      </w:pPr>
+      <w:r>
+        <w:tab/>
+        <w:t>III.1 Sprint 1 Progress Report</w:t>
+      </w:r>
+    </w:p>
+    <w:p>
+      <w:pPr>
+        <w:pStyle w:val="Heading2"/>
+        <w:ind w:firstLine="720"/>
+      </w:pPr>
+      <w:r>
+        <w:t>III.2 Sprint 2</w:t>
+      </w:r>
+      <w:bookmarkStart w:id="52" w:name="_GoBack"/>
       <w:bookmarkEnd w:id="52"/>
-    </w:p>
+      <w:r>
+        <w:t xml:space="preserve"> Progress Report</w:t>
+      </w:r>
+    </w:p>
+    <w:p/>
     <w:p>
       <w:pPr>
         <w:autoSpaceDE w:val="0"/>
@@ -7231,6 +7525,124 @@
       <w:szCs w:val="18"/>
     </w:rPr>
   </w:style>
+  <w:style w:type="table" w:styleId="TableGrid">
+    <w:name w:val="Table Grid"/>
+    <w:basedOn w:val="TableNormal"/>
+    <w:uiPriority w:val="59"/>
+    <w:rsid w:val="003D553B"/>
+    <w:pPr>
+      <w:spacing w:after="0" w:line="240" w:lineRule="auto"/>
+    </w:pPr>
+    <w:tblPr>
+      <w:tblInd w:w="0" w:type="dxa"/>
+      <w:tblBorders>
+        <w:top w:val="single" w:sz="4" w:space="0" w:color="auto"/>
+        <w:left w:val="single" w:sz="4" w:space="0" w:color="auto"/>
+        <w:bottom w:val="single" w:sz="4" w:space="0" w:color="auto"/>
+        <w:right w:val="single" w:sz="4" w:space="0" w:color="auto"/>
+        <w:insideH w:val="single" w:sz="4" w:space="0" w:color="auto"/>
+        <w:insideV w:val="single" w:sz="4" w:space="0" w:color="auto"/>
+      </w:tblBorders>
+      <w:tblCellMar>
+        <w:top w:w="0" w:type="dxa"/>
+        <w:left w:w="108" w:type="dxa"/>
+        <w:bottom w:w="0" w:type="dxa"/>
+        <w:right w:w="108" w:type="dxa"/>
+      </w:tblCellMar>
+    </w:tblPr>
+  </w:style>
+  <w:style w:type="table" w:styleId="LightList-Accent1">
+    <w:name w:val="Light List Accent 1"/>
+    <w:basedOn w:val="TableNormal"/>
+    <w:uiPriority w:val="61"/>
+    <w:rsid w:val="003D553B"/>
+    <w:pPr>
+      <w:spacing w:after="0" w:line="240" w:lineRule="auto"/>
+    </w:pPr>
+    <w:tblPr>
+      <w:tblStyleRowBandSize w:val="1"/>
+      <w:tblStyleColBandSize w:val="1"/>
+      <w:tblInd w:w="0" w:type="dxa"/>
+      <w:tblBorders>
+        <w:top w:val="single" w:sz="8" w:space="0" w:color="4F81BD" w:themeColor="accent1"/>
+        <w:left w:val="single" w:sz="8" w:space="0" w:color="4F81BD" w:themeColor="accent1"/>
+        <w:bottom w:val="single" w:sz="8" w:space="0" w:color="4F81BD" w:themeColor="accent1"/>
+        <w:right w:val="single" w:sz="8" w:space="0" w:color="4F81BD" w:themeColor="accent1"/>
+      </w:tblBorders>
+      <w:tblCellMar>
+        <w:top w:w="0" w:type="dxa"/>
+        <w:left w:w="108" w:type="dxa"/>
+        <w:bottom w:w="0" w:type="dxa"/>
+        <w:right w:w="108" w:type="dxa"/>
+      </w:tblCellMar>
+    </w:tblPr>
+    <w:tblStylePr w:type="firstRow">
+      <w:pPr>
+        <w:spacing w:before="0" w:after="0" w:line="240" w:lineRule="auto"/>
+      </w:pPr>
+      <w:rPr>
+        <w:b/>
+        <w:bCs/>
+        <w:color w:val="FFFFFF" w:themeColor="background1"/>
+      </w:rPr>
+      <w:tblPr/>
+      <w:tcPr>
+        <w:shd w:val="clear" w:color="auto" w:fill="4F81BD" w:themeFill="accent1"/>
+      </w:tcPr>
+    </w:tblStylePr>
+    <w:tblStylePr w:type="lastRow">
+      <w:pPr>
+        <w:spacing w:before="0" w:after="0" w:line="240" w:lineRule="auto"/>
+      </w:pPr>
+      <w:rPr>
+        <w:b/>
+        <w:bCs/>
+      </w:rPr>
+      <w:tblPr/>
+      <w:tcPr>
+        <w:tcBorders>
+          <w:top w:val="double" w:sz="6" w:space="0" w:color="4F81BD" w:themeColor="accent1"/>
+          <w:left w:val="single" w:sz="8" w:space="0" w:color="4F81BD" w:themeColor="accent1"/>
+          <w:bottom w:val="single" w:sz="8" w:space="0" w:color="4F81BD" w:themeColor="accent1"/>
+          <w:right w:val="single" w:sz="8" w:space="0" w:color="4F81BD" w:themeColor="accent1"/>
+        </w:tcBorders>
+      </w:tcPr>
+    </w:tblStylePr>
+    <w:tblStylePr w:type="firstCol">
+      <w:rPr>
+        <w:b/>
+        <w:bCs/>
+      </w:rPr>
+    </w:tblStylePr>
+    <w:tblStylePr w:type="lastCol">
+      <w:rPr>
+        <w:b/>
+        <w:bCs/>
+      </w:rPr>
+    </w:tblStylePr>
+    <w:tblStylePr w:type="band1Vert">
+      <w:tblPr/>
+      <w:tcPr>
+        <w:tcBorders>
+          <w:top w:val="single" w:sz="8" w:space="0" w:color="4F81BD" w:themeColor="accent1"/>
+          <w:left w:val="single" w:sz="8" w:space="0" w:color="4F81BD" w:themeColor="accent1"/>
+          <w:bottom w:val="single" w:sz="8" w:space="0" w:color="4F81BD" w:themeColor="accent1"/>
+          <w:right w:val="single" w:sz="8" w:space="0" w:color="4F81BD" w:themeColor="accent1"/>
+        </w:tcBorders>
+      </w:tcPr>
+    </w:tblStylePr>
+    <w:tblStylePr w:type="band1Horz">
+      <w:tblPr/>
+      <w:tcPr>
+        <w:tcBorders>
+          <w:top w:val="single" w:sz="8" w:space="0" w:color="4F81BD" w:themeColor="accent1"/>
+          <w:left w:val="single" w:sz="8" w:space="0" w:color="4F81BD" w:themeColor="accent1"/>
+          <w:bottom w:val="single" w:sz="8" w:space="0" w:color="4F81BD" w:themeColor="accent1"/>
+          <w:right w:val="single" w:sz="8" w:space="0" w:color="4F81BD" w:themeColor="accent1"/>
+        </w:tcBorders>
+      </w:tcPr>
+    </w:tblStylePr>
+  </w:style>
 </w:styles>
 </file>
 
@@ -7750,6 +8162,124 @@
       <w:szCs w:val="18"/>
     </w:rPr>
   </w:style>
+  <w:style w:type="table" w:styleId="TableGrid">
+    <w:name w:val="Table Grid"/>
+    <w:basedOn w:val="TableNormal"/>
+    <w:uiPriority w:val="59"/>
+    <w:rsid w:val="003D553B"/>
+    <w:pPr>
+      <w:spacing w:after="0" w:line="240" w:lineRule="auto"/>
+    </w:pPr>
+    <w:tblPr>
+      <w:tblInd w:w="0" w:type="dxa"/>
+      <w:tblBorders>
+        <w:top w:val="single" w:sz="4" w:space="0" w:color="auto"/>
+        <w:left w:val="single" w:sz="4" w:space="0" w:color="auto"/>
+        <w:bottom w:val="single" w:sz="4" w:space="0" w:color="auto"/>
+        <w:right w:val="single" w:sz="4" w:space="0" w:color="auto"/>
+        <w:insideH w:val="single" w:sz="4" w:space="0" w:color="auto"/>
+        <w:insideV w:val="single" w:sz="4" w:space="0" w:color="auto"/>
+      </w:tblBorders>
+      <w:tblCellMar>
+        <w:top w:w="0" w:type="dxa"/>
+        <w:left w:w="108" w:type="dxa"/>
+        <w:bottom w:w="0" w:type="dxa"/>
+        <w:right w:w="108" w:type="dxa"/>
+      </w:tblCellMar>
+    </w:tblPr>
+  </w:style>
+  <w:style w:type="table" w:styleId="LightList-Accent1">
+    <w:name w:val="Light List Accent 1"/>
+    <w:basedOn w:val="TableNormal"/>
+    <w:uiPriority w:val="61"/>
+    <w:rsid w:val="003D553B"/>
+    <w:pPr>
+      <w:spacing w:after="0" w:line="240" w:lineRule="auto"/>
+    </w:pPr>
+    <w:tblPr>
+      <w:tblStyleRowBandSize w:val="1"/>
+      <w:tblStyleColBandSize w:val="1"/>
+      <w:tblInd w:w="0" w:type="dxa"/>
+      <w:tblBorders>
+        <w:top w:val="single" w:sz="8" w:space="0" w:color="4F81BD" w:themeColor="accent1"/>
+        <w:left w:val="single" w:sz="8" w:space="0" w:color="4F81BD" w:themeColor="accent1"/>
+        <w:bottom w:val="single" w:sz="8" w:space="0" w:color="4F81BD" w:themeColor="accent1"/>
+        <w:right w:val="single" w:sz="8" w:space="0" w:color="4F81BD" w:themeColor="accent1"/>
+      </w:tblBorders>
+      <w:tblCellMar>
+        <w:top w:w="0" w:type="dxa"/>
+        <w:left w:w="108" w:type="dxa"/>
+        <w:bottom w:w="0" w:type="dxa"/>
+        <w:right w:w="108" w:type="dxa"/>
+      </w:tblCellMar>
+    </w:tblPr>
+    <w:tblStylePr w:type="firstRow">
+      <w:pPr>
+        <w:spacing w:before="0" w:after="0" w:line="240" w:lineRule="auto"/>
+      </w:pPr>
+      <w:rPr>
+        <w:b/>
+        <w:bCs/>
+        <w:color w:val="FFFFFF" w:themeColor="background1"/>
+      </w:rPr>
+      <w:tblPr/>
+      <w:tcPr>
+        <w:shd w:val="clear" w:color="auto" w:fill="4F81BD" w:themeFill="accent1"/>
+      </w:tcPr>
+    </w:tblStylePr>
+    <w:tblStylePr w:type="lastRow">
+      <w:pPr>
+        <w:spacing w:before="0" w:after="0" w:line="240" w:lineRule="auto"/>
+      </w:pPr>
+      <w:rPr>
+        <w:b/>
+        <w:bCs/>
+      </w:rPr>
+      <w:tblPr/>
+      <w:tcPr>
+        <w:tcBorders>
+          <w:top w:val="double" w:sz="6" w:space="0" w:color="4F81BD" w:themeColor="accent1"/>
+          <w:left w:val="single" w:sz="8" w:space="0" w:color="4F81BD" w:themeColor="accent1"/>
+          <w:bottom w:val="single" w:sz="8" w:space="0" w:color="4F81BD" w:themeColor="accent1"/>
+          <w:right w:val="single" w:sz="8" w:space="0" w:color="4F81BD" w:themeColor="accent1"/>
+        </w:tcBorders>
+      </w:tcPr>
+    </w:tblStylePr>
+    <w:tblStylePr w:type="firstCol">
+      <w:rPr>
+        <w:b/>
+        <w:bCs/>
+      </w:rPr>
+    </w:tblStylePr>
+    <w:tblStylePr w:type="lastCol">
+      <w:rPr>
+        <w:b/>
+        <w:bCs/>
+      </w:rPr>
+    </w:tblStylePr>
+    <w:tblStylePr w:type="band1Vert">
+      <w:tblPr/>
+      <w:tcPr>
+        <w:tcBorders>
+          <w:top w:val="single" w:sz="8" w:space="0" w:color="4F81BD" w:themeColor="accent1"/>
+          <w:left w:val="single" w:sz="8" w:space="0" w:color="4F81BD" w:themeColor="accent1"/>
+          <w:bottom w:val="single" w:sz="8" w:space="0" w:color="4F81BD" w:themeColor="accent1"/>
+          <w:right w:val="single" w:sz="8" w:space="0" w:color="4F81BD" w:themeColor="accent1"/>
+        </w:tcBorders>
+      </w:tcPr>
+    </w:tblStylePr>
+    <w:tblStylePr w:type="band1Horz">
+      <w:tblPr/>
+      <w:tcPr>
+        <w:tcBorders>
+          <w:top w:val="single" w:sz="8" w:space="0" w:color="4F81BD" w:themeColor="accent1"/>
+          <w:left w:val="single" w:sz="8" w:space="0" w:color="4F81BD" w:themeColor="accent1"/>
+          <w:bottom w:val="single" w:sz="8" w:space="0" w:color="4F81BD" w:themeColor="accent1"/>
+          <w:right w:val="single" w:sz="8" w:space="0" w:color="4F81BD" w:themeColor="accent1"/>
+        </w:tcBorders>
+      </w:tcPr>
+    </w:tblStylePr>
+  </w:style>
 </w:styles>
 </file>
 
@@ -8043,7 +8573,7 @@
 </file>
 
 <file path=customXml/itemProps1.xml><?xml version="1.0" encoding="utf-8"?>
-<ds:datastoreItem xmlns:ds="http://schemas.openxmlformats.org/officeDocument/2006/customXml" ds:itemID="{5FDD129E-E46A-4A99-864C-DD23C92C44C1}">
+<ds:datastoreItem xmlns:ds="http://schemas.openxmlformats.org/officeDocument/2006/customXml" ds:itemID="{88E63F08-DF84-412A-868E-CEE8EF2905D2}">
   <ds:schemaRefs>
     <ds:schemaRef ds:uri="http://schemas.openxmlformats.org/officeDocument/2006/bibliography"/>
   </ds:schemaRefs>

</xml_diff>

<commit_message>
Added scope to design document
</commit_message>
<xml_diff>
--- a/srDesign_Design.docx
+++ b/srDesign_Design.docx
@@ -609,16 +609,10 @@
             <w:cnfStyle w:val="001000000000" w:firstRow="0" w:lastRow="0" w:firstColumn="1" w:lastColumn="0" w:oddVBand="0" w:evenVBand="0" w:oddHBand="0" w:evenHBand="0" w:firstRowFirstColumn="0" w:firstRowLastColumn="0" w:lastRowFirstColumn="0" w:lastRowLastColumn="0"/>
             <w:tcW w:w="2394" w:type="dxa"/>
           </w:tcPr>
-          <w:p/>
-        </w:tc>
-        <w:tc>
-          <w:tcPr>
-            <w:tcW w:w="2394" w:type="dxa"/>
-          </w:tcPr>
           <w:p>
-            <w:pPr>
-              <w:cnfStyle w:val="000000000000" w:firstRow="0" w:lastRow="0" w:firstColumn="0" w:lastColumn="0" w:oddVBand="0" w:evenVBand="0" w:oddHBand="0" w:evenHBand="0" w:firstRowFirstColumn="0" w:firstRowLastColumn="0" w:lastRowFirstColumn="0" w:lastRowLastColumn="0"/>
-            </w:pPr>
+            <w:r>
+              <w:t>10/23/2012</w:t>
+            </w:r>
           </w:p>
         </w:tc>
         <w:tc>
@@ -629,6 +623,9 @@
             <w:pPr>
               <w:cnfStyle w:val="000000000000" w:firstRow="0" w:lastRow="0" w:firstColumn="0" w:lastColumn="0" w:oddVBand="0" w:evenVBand="0" w:oddHBand="0" w:evenHBand="0" w:firstRowFirstColumn="0" w:firstRowLastColumn="0" w:lastRowFirstColumn="0" w:lastRowLastColumn="0"/>
             </w:pPr>
+            <w:r>
+              <w:t>David Jarman</w:t>
+            </w:r>
           </w:p>
         </w:tc>
         <w:tc>
@@ -639,6 +636,22 @@
             <w:pPr>
               <w:cnfStyle w:val="000000000000" w:firstRow="0" w:lastRow="0" w:firstColumn="0" w:lastColumn="0" w:oddVBand="0" w:evenVBand="0" w:oddHBand="0" w:evenHBand="0" w:firstRowFirstColumn="0" w:firstRowLastColumn="0" w:lastRowFirstColumn="0" w:lastRowLastColumn="0"/>
             </w:pPr>
+            <w:r>
+              <w:t>1.1.0</w:t>
+            </w:r>
+          </w:p>
+        </w:tc>
+        <w:tc>
+          <w:tcPr>
+            <w:tcW w:w="2394" w:type="dxa"/>
+          </w:tcPr>
+          <w:p>
+            <w:pPr>
+              <w:cnfStyle w:val="000000000000" w:firstRow="0" w:lastRow="0" w:firstColumn="0" w:lastColumn="0" w:oddVBand="0" w:evenVBand="0" w:oddHBand="0" w:evenHBand="0" w:firstRowFirstColumn="0" w:firstRowLastColumn="0" w:lastRowFirstColumn="0" w:lastRowLastColumn="0"/>
+            </w:pPr>
+            <w:r>
+              <w:t>Sandbox Vision</w:t>
+            </w:r>
           </w:p>
         </w:tc>
       </w:tr>
@@ -734,12 +747,7 @@
             <w:pStyle w:val="TOCHeading"/>
           </w:pPr>
           <w:r>
-            <w:t>Table of</w:t>
-          </w:r>
-          <w:bookmarkStart w:id="1" w:name="_GoBack"/>
-          <w:bookmarkEnd w:id="1"/>
-          <w:r>
-            <w:t xml:space="preserve"> Contents</w:t>
+            <w:t>Table of Contents</w:t>
           </w:r>
         </w:p>
         <w:p>
@@ -5609,12 +5617,12 @@
           <w:numId w:val="11"/>
         </w:numPr>
       </w:pPr>
-      <w:bookmarkStart w:id="2" w:name="_Toc336939599"/>
+      <w:bookmarkStart w:id="1" w:name="_Toc336939599"/>
       <w:r>
         <w:lastRenderedPageBreak/>
         <w:t>Design Document</w:t>
       </w:r>
-      <w:bookmarkEnd w:id="2"/>
+      <w:bookmarkEnd w:id="1"/>
     </w:p>
     <w:p>
       <w:pPr>
@@ -5624,10 +5632,35 @@
           <w:numId w:val="11"/>
         </w:numPr>
       </w:pPr>
-      <w:bookmarkStart w:id="3" w:name="_Toc336939600"/>
+      <w:bookmarkStart w:id="2" w:name="_Toc336939600"/>
       <w:r>
         <w:t>Scope</w:t>
       </w:r>
+      <w:bookmarkEnd w:id="2"/>
+    </w:p>
+    <w:p>
+      <w:pPr>
+        <w:ind w:left="360"/>
+      </w:pPr>
+      <w:r>
+        <w:t>This document is meant to help define how each part of the game server environment</w:t>
+      </w:r>
+      <w:r>
+        <w:t xml:space="preserve"> will fit together and give a g</w:t>
+      </w:r>
+      <w:r>
+        <w:t>limpse into how each part will be created.</w:t>
+      </w:r>
+      <w:r>
+        <w:t xml:space="preserve"> It will also give an overview of the team working on the project, and give descriptions for each person involved and their related role(s).</w:t>
+      </w:r>
+      <w:r>
+        <w:t xml:space="preserve"> </w:t>
+      </w:r>
+      <w:r>
+        <w:t>Testing procedures tailored to this project will be described as well as the tools used throughout the project.</w:t>
+      </w:r>
+      <w:bookmarkStart w:id="3" w:name="_GoBack"/>
       <w:bookmarkEnd w:id="3"/>
     </w:p>
     <w:p>
@@ -5670,24 +5703,13 @@
         </w:rPr>
         <w:t xml:space="preserve"> </w:t>
       </w:r>
-      <w:bookmarkStart w:id="5" w:name="_Toc336939602"/>
       <w:r>
         <w:rPr>
           <w:rStyle w:val="Heading3Char"/>
           <w:b/>
         </w:rPr>
-        <w:t xml:space="preserve">Major System Component </w:t>
-      </w:r>
-      <w:r>
-        <w:rPr>
-          <w:rStyle w:val="Heading3Char"/>
-        </w:rPr>
-        <w:t>#</w:t>
-      </w:r>
-      <w:r>
-        <w:t>1</w:t>
-      </w:r>
-      <w:bookmarkEnd w:id="5"/>
+        <w:t>Set Top Box Display Mechanism</w:t>
+      </w:r>
     </w:p>
     <w:p>
       <w:pPr>
@@ -5706,15 +5728,7 @@
         <w:t>initializer</w:t>
       </w:r>
       <w:r>
-        <w:t xml:space="preserve">. Once this mechanism has authenticated a user it will load the list of STB games provided by the game server at run time. When a user selects a game it will setup the game as a single or multiplayer environment. In a single player environment the user will play against </w:t>
-      </w:r>
-      <w:proofErr w:type="gramStart"/>
-      <w:r>
-        <w:t>themselves</w:t>
-      </w:r>
-      <w:proofErr w:type="gramEnd"/>
-      <w:r>
-        <w:t>. On the other hand, a multiplayer environment provides the user with the option of playing against another user on the network or a computer player. Additionally this component will be the base class controlling the derived class features.</w:t>
+        <w:t>. Once this mechanism has authenticated a user it will load the list of STB games provided by the game server at run time. When a user selects a game it will setup the game as a single or multiplayer environment. In a single player environment the user will play against themselves. On the other hand, a multiplayer environment provides the user with the option of playing against another user on the network or a computer player. Additionally this component will be the base class controlling the derived class features.</w:t>
       </w:r>
     </w:p>
     <w:p>
@@ -5725,11 +5739,44 @@
           <w:numId w:val="11"/>
         </w:numPr>
       </w:pPr>
-      <w:bookmarkStart w:id="6" w:name="_Toc336939603"/>
-      <w:r>
-        <w:t>Major System Component #2</w:t>
-      </w:r>
-      <w:bookmarkEnd w:id="6"/>
+      <w:r>
+        <w:t>Communication Mechanism</w:t>
+      </w:r>
+    </w:p>
+    <w:p>
+      <w:pPr>
+        <w:ind w:left="720"/>
+      </w:pPr>
+      <w:r>
+        <w:t>Communication is a key and vital component of this project. There are three different layers that make up the multiplayer environment, the first being a STB, which displays the game UI. The second is the APMax layer, consisting of a physical APMax pair and during development, a virtual APMax, which will allow communication to the third layer, the game server.</w:t>
+      </w:r>
+      <w:r>
+        <w:t xml:space="preserve"> There are four cases of communication. There is communication from the game server to the APMax, then from the APMax to the STB. </w:t>
+      </w:r>
+      <w:r>
+        <w:t xml:space="preserve">The second half consists of communication from the STB back to the APMax, then the APMax to the game server. </w:t>
+      </w:r>
+      <w:r>
+        <w:t>The only piece that is current</w:t>
+      </w:r>
+      <w:r>
+        <w:t xml:space="preserve">ly defined is the APMax to STB. The rest will be developed in a sandbox environment, </w:t>
+      </w:r>
+      <w:r>
+        <w:t xml:space="preserve">where </w:t>
+      </w:r>
+      <w:r>
+        <w:t>all three layers</w:t>
+      </w:r>
+      <w:r>
+        <w:t xml:space="preserve"> </w:t>
+      </w:r>
+      <w:r>
+        <w:t>will be able to quickly adapt to different communication protocols</w:t>
+      </w:r>
+      <w:r>
+        <w:t>.</w:t>
+      </w:r>
     </w:p>
     <w:p>
       <w:pPr>
@@ -5739,11 +5786,38 @@
           <w:numId w:val="11"/>
         </w:numPr>
       </w:pPr>
-      <w:bookmarkStart w:id="7" w:name="_Toc336939604"/>
-      <w:r>
-        <w:t>Major System Component #3</w:t>
-      </w:r>
-      <w:bookmarkEnd w:id="7"/>
+      <w:r>
+        <w:t>Command Link</w:t>
+      </w:r>
+    </w:p>
+    <w:p>
+      <w:pPr>
+        <w:ind w:left="720"/>
+      </w:pPr>
+      <w:r>
+        <w:t>Command Link</w:t>
+      </w:r>
+      <w:r>
+        <w:t xml:space="preserve"> (CL)</w:t>
+      </w:r>
+      <w:r>
+        <w:t xml:space="preserve"> is the communication protocol that Innovative</w:t>
+      </w:r>
+      <w:r>
+        <w:t xml:space="preserve"> Systems</w:t>
+      </w:r>
+      <w:r>
+        <w:t xml:space="preserve"> uses to allow peripheral devices to send and receive information from a STB. </w:t>
+      </w:r>
+      <w:r>
+        <w:t>There are two types of Command Link messages</w:t>
+      </w:r>
+      <w:r>
+        <w:t xml:space="preserve"> that are used. The first type is called CL1, which is used between an APMax and a STB. The second type is CL2, which is no more than a wrapper for CL1 messages. Peripheral devices, such as the game server, create CL1 messages, then wraps that message in a CL2 message. Once the CL2 message is sent, the APMax receives and unwraps the message, and passes the CL1 message along to the intended STB.</w:t>
+      </w:r>
+      <w:r>
+        <w:t xml:space="preserve"> </w:t>
+      </w:r>
     </w:p>
     <w:p>
       <w:pPr>
@@ -5753,11 +5827,12 @@
           <w:numId w:val="11"/>
         </w:numPr>
       </w:pPr>
-      <w:bookmarkStart w:id="8" w:name="_Toc336939605"/>
-      <w:r>
+      <w:bookmarkStart w:id="5" w:name="_Toc336939605"/>
+      <w:r>
+        <w:lastRenderedPageBreak/>
         <w:t>Systems Goals</w:t>
       </w:r>
-      <w:bookmarkEnd w:id="8"/>
+      <w:bookmarkEnd w:id="5"/>
     </w:p>
     <w:p>
       <w:pPr>
@@ -5775,11 +5850,11 @@
           <w:numId w:val="11"/>
         </w:numPr>
       </w:pPr>
-      <w:bookmarkStart w:id="9" w:name="_Toc336939606"/>
+      <w:bookmarkStart w:id="6" w:name="_Toc336939606"/>
       <w:r>
         <w:t>System Overview and Diagram</w:t>
       </w:r>
-      <w:bookmarkEnd w:id="9"/>
+      <w:bookmarkEnd w:id="6"/>
     </w:p>
     <w:p>
       <w:pPr>
@@ -5789,11 +5864,11 @@
           <w:numId w:val="11"/>
         </w:numPr>
       </w:pPr>
-      <w:bookmarkStart w:id="10" w:name="_Toc336939607"/>
+      <w:bookmarkStart w:id="7" w:name="_Toc336939607"/>
       <w:r>
         <w:t>Technologies Overview</w:t>
       </w:r>
-      <w:bookmarkEnd w:id="10"/>
+      <w:bookmarkEnd w:id="7"/>
     </w:p>
     <w:p>
       <w:pPr>
@@ -5822,11 +5897,11 @@
           <w:numId w:val="11"/>
         </w:numPr>
       </w:pPr>
-      <w:bookmarkStart w:id="11" w:name="_Toc336939608"/>
+      <w:bookmarkStart w:id="8" w:name="_Toc336939608"/>
       <w:r>
         <w:t>Project Overview</w:t>
       </w:r>
-      <w:bookmarkEnd w:id="11"/>
+      <w:bookmarkEnd w:id="8"/>
     </w:p>
     <w:p>
       <w:pPr>
@@ -5836,11 +5911,47 @@
           <w:numId w:val="11"/>
         </w:numPr>
       </w:pPr>
-      <w:bookmarkStart w:id="12" w:name="_Toc336939609"/>
+      <w:bookmarkStart w:id="9" w:name="_Toc336939609"/>
       <w:r>
         <w:t>Team Members and Roles</w:t>
       </w:r>
-      <w:bookmarkEnd w:id="12"/>
+      <w:bookmarkEnd w:id="9"/>
+    </w:p>
+    <w:p>
+      <w:pPr>
+        <w:ind w:left="360"/>
+      </w:pPr>
+      <w:r>
+        <w:t>Marshall Gaucher – Marshall has the most experience with game design and implementation, as he spent a summer developing a checkers game on the Set Top Box environment.</w:t>
+      </w:r>
+      <w:r>
+        <w:t xml:space="preserve"> During this project, he will drive STB and game development. </w:t>
+      </w:r>
+    </w:p>
+    <w:p>
+      <w:pPr>
+        <w:ind w:left="360"/>
+      </w:pPr>
+      <w:r>
+        <w:t xml:space="preserve">Kevin Worner </w:t>
+      </w:r>
+      <w:r>
+        <w:t>–</w:t>
+      </w:r>
+      <w:r>
+        <w:t xml:space="preserve"> </w:t>
+      </w:r>
+      <w:r>
+        <w:t xml:space="preserve">With nearly a year and a half of C# development and several projects involving networking under his belt, Kevin will lead the team in setting up the game server. </w:t>
+      </w:r>
+    </w:p>
+    <w:p>
+      <w:pPr>
+        <w:ind w:left="360"/>
+      </w:pPr>
+      <w:r>
+        <w:t xml:space="preserve">David Jarman – Having already implemented peripheral side Command Link communications in a previous project, David will push design of new Command Link protocols for games to communicate back to the server. </w:t>
+      </w:r>
     </w:p>
     <w:p>
       <w:pPr>
@@ -5850,11 +5961,11 @@
           <w:numId w:val="11"/>
         </w:numPr>
       </w:pPr>
-      <w:bookmarkStart w:id="13" w:name="_Toc336939610"/>
+      <w:bookmarkStart w:id="10" w:name="_Toc336939610"/>
       <w:r>
         <w:t>Project Management Approach</w:t>
       </w:r>
-      <w:bookmarkEnd w:id="13"/>
+      <w:bookmarkEnd w:id="10"/>
     </w:p>
     <w:p>
       <w:pPr>
@@ -5864,11 +5975,11 @@
           <w:numId w:val="11"/>
         </w:numPr>
       </w:pPr>
-      <w:bookmarkStart w:id="14" w:name="_Toc336939611"/>
+      <w:bookmarkStart w:id="11" w:name="_Toc336939611"/>
       <w:r>
         <w:t>Phase Overview</w:t>
       </w:r>
-      <w:bookmarkEnd w:id="14"/>
+      <w:bookmarkEnd w:id="11"/>
     </w:p>
     <w:p/>
     <w:p/>
@@ -5880,35 +5991,89 @@
           <w:numId w:val="11"/>
         </w:numPr>
       </w:pPr>
-      <w:bookmarkStart w:id="15" w:name="_Toc336939612"/>
+      <w:bookmarkStart w:id="12" w:name="_Toc336939612"/>
+      <w:r>
+        <w:t>Terminology and Acronyms</w:t>
+      </w:r>
+      <w:bookmarkEnd w:id="12"/>
+    </w:p>
+    <w:p>
+      <w:pPr>
+        <w:ind w:left="360"/>
+      </w:pPr>
+      <w:r>
+        <w:t>STB – Set Top Box</w:t>
+      </w:r>
+    </w:p>
+    <w:p>
+      <w:pPr>
+        <w:ind w:left="360"/>
+      </w:pPr>
+      <w:r>
+        <w:t>TCP – Transmission Control Protocol</w:t>
+      </w:r>
+    </w:p>
+    <w:p>
+      <w:pPr>
+        <w:ind w:left="360"/>
+      </w:pPr>
+      <w:r>
+        <w:t>UDP – User Datagram Protocol</w:t>
+      </w:r>
+    </w:p>
+    <w:p>
+      <w:pPr>
+        <w:ind w:left="360"/>
+      </w:pPr>
+      <w:r>
+        <w:t>CL – Command Link</w:t>
+      </w:r>
+    </w:p>
+    <w:p>
+      <w:pPr>
+        <w:ind w:left="360"/>
+      </w:pPr>
+      <w:r>
+        <w:t>UI – User Interface</w:t>
+      </w:r>
+    </w:p>
+    <w:p>
+      <w:pPr>
+        <w:ind w:left="360"/>
+      </w:pPr>
+      <w:r>
+        <w:t>GUI – Generic User Interface</w:t>
+      </w:r>
+    </w:p>
+    <w:p>
+      <w:pPr>
+        <w:ind w:left="360"/>
+      </w:pPr>
+      <w:r>
+        <w:t>IPTV – Internet Protocol Television</w:t>
+      </w:r>
+    </w:p>
+    <w:p>
+      <w:pPr>
+        <w:ind w:left="360"/>
+      </w:pPr>
       <w:r>
         <w:lastRenderedPageBreak/>
-        <w:t>Terminology and Acronyms</w:t>
-      </w:r>
-      <w:bookmarkEnd w:id="15"/>
+        <w:t xml:space="preserve">APMax – </w:t>
+      </w:r>
+      <w:r>
+        <w:t>Innovative System’s</w:t>
+      </w:r>
+      <w:r>
+        <w:t xml:space="preserve"> middleware solution for IPTV</w:t>
+      </w:r>
     </w:p>
     <w:p>
       <w:pPr>
         <w:ind w:left="360"/>
       </w:pPr>
       <w:r>
-        <w:t>STB – Set Top Box</w:t>
-      </w:r>
-    </w:p>
-    <w:p>
-      <w:pPr>
-        <w:ind w:left="360"/>
-      </w:pPr>
-      <w:r>
-        <w:t>TCP – Transmission Control Protocol</w:t>
-      </w:r>
-    </w:p>
-    <w:p>
-      <w:pPr>
-        <w:ind w:left="360"/>
-      </w:pPr>
-      <w:r>
-        <w:t>UDP – User Datagram Protocol</w:t>
+        <w:t>IS – Innovative Systems</w:t>
       </w:r>
     </w:p>
     <w:p>
@@ -5919,12 +6084,12 @@
           <w:numId w:val="11"/>
         </w:numPr>
       </w:pPr>
-      <w:bookmarkStart w:id="16" w:name="_Toc336939613"/>
+      <w:bookmarkStart w:id="13" w:name="_Toc336939613"/>
       <w:r>
         <w:lastRenderedPageBreak/>
         <w:t>Requirements</w:t>
       </w:r>
-      <w:bookmarkEnd w:id="16"/>
+      <w:bookmarkEnd w:id="13"/>
     </w:p>
     <w:p>
       <w:pPr>
@@ -5934,11 +6099,11 @@
           <w:numId w:val="11"/>
         </w:numPr>
       </w:pPr>
-      <w:bookmarkStart w:id="17" w:name="_Toc336939614"/>
+      <w:bookmarkStart w:id="14" w:name="_Toc336939614"/>
       <w:r>
         <w:t>Design and Implementation</w:t>
       </w:r>
-      <w:bookmarkEnd w:id="17"/>
+      <w:bookmarkEnd w:id="14"/>
     </w:p>
     <w:p>
       <w:pPr>
@@ -5948,11 +6113,11 @@
           <w:numId w:val="11"/>
         </w:numPr>
       </w:pPr>
-      <w:bookmarkStart w:id="18" w:name="_Toc336939615"/>
+      <w:bookmarkStart w:id="15" w:name="_Toc336939615"/>
       <w:r>
         <w:t>Major Component #1</w:t>
       </w:r>
-      <w:bookmarkEnd w:id="18"/>
+      <w:bookmarkEnd w:id="15"/>
     </w:p>
     <w:p>
       <w:pPr>
@@ -5962,11 +6127,11 @@
           <w:numId w:val="11"/>
         </w:numPr>
       </w:pPr>
-      <w:bookmarkStart w:id="19" w:name="_Toc336939616"/>
+      <w:bookmarkStart w:id="16" w:name="_Toc336939616"/>
       <w:r>
         <w:t>Technologies Used</w:t>
       </w:r>
-      <w:bookmarkEnd w:id="19"/>
+      <w:bookmarkEnd w:id="16"/>
     </w:p>
     <w:p>
       <w:pPr>
@@ -5976,11 +6141,11 @@
           <w:numId w:val="11"/>
         </w:numPr>
       </w:pPr>
-      <w:bookmarkStart w:id="20" w:name="_Toc336939617"/>
+      <w:bookmarkStart w:id="17" w:name="_Toc336939617"/>
       <w:r>
         <w:t>Component Overview</w:t>
       </w:r>
-      <w:bookmarkEnd w:id="20"/>
+      <w:bookmarkEnd w:id="17"/>
     </w:p>
     <w:p>
       <w:pPr>
@@ -5990,11 +6155,11 @@
           <w:numId w:val="11"/>
         </w:numPr>
       </w:pPr>
-      <w:bookmarkStart w:id="21" w:name="_Toc336939618"/>
+      <w:bookmarkStart w:id="18" w:name="_Toc336939618"/>
       <w:r>
         <w:t>Phase Overview</w:t>
       </w:r>
-      <w:bookmarkEnd w:id="21"/>
+      <w:bookmarkEnd w:id="18"/>
     </w:p>
     <w:p>
       <w:pPr>
@@ -6004,11 +6169,11 @@
           <w:numId w:val="11"/>
         </w:numPr>
       </w:pPr>
-      <w:bookmarkStart w:id="22" w:name="_Toc336939619"/>
+      <w:bookmarkStart w:id="19" w:name="_Toc336939619"/>
       <w:r>
         <w:t>Architecture Diagram</w:t>
       </w:r>
-      <w:bookmarkEnd w:id="22"/>
+      <w:bookmarkEnd w:id="19"/>
     </w:p>
     <w:p>
       <w:pPr>
@@ -6018,11 +6183,11 @@
           <w:numId w:val="11"/>
         </w:numPr>
       </w:pPr>
-      <w:bookmarkStart w:id="23" w:name="_Toc336939620"/>
+      <w:bookmarkStart w:id="20" w:name="_Toc336939620"/>
       <w:r>
         <w:t>Data Flow Diagram</w:t>
       </w:r>
-      <w:bookmarkEnd w:id="23"/>
+      <w:bookmarkEnd w:id="20"/>
     </w:p>
     <w:p>
       <w:pPr>
@@ -6032,11 +6197,11 @@
           <w:numId w:val="11"/>
         </w:numPr>
       </w:pPr>
-      <w:bookmarkStart w:id="24" w:name="_Toc336939621"/>
+      <w:bookmarkStart w:id="21" w:name="_Toc336939621"/>
       <w:r>
         <w:t>Design Details</w:t>
       </w:r>
-      <w:bookmarkEnd w:id="24"/>
+      <w:bookmarkEnd w:id="21"/>
     </w:p>
     <w:p>
       <w:pPr>
@@ -6046,11 +6211,11 @@
           <w:numId w:val="11"/>
         </w:numPr>
       </w:pPr>
-      <w:bookmarkStart w:id="25" w:name="_Toc336939622"/>
+      <w:bookmarkStart w:id="22" w:name="_Toc336939622"/>
       <w:r>
         <w:t>Major Component #2</w:t>
       </w:r>
-      <w:bookmarkEnd w:id="25"/>
+      <w:bookmarkEnd w:id="22"/>
     </w:p>
     <w:p>
       <w:pPr>
@@ -6060,11 +6225,11 @@
           <w:numId w:val="11"/>
         </w:numPr>
       </w:pPr>
-      <w:bookmarkStart w:id="26" w:name="_Toc336939623"/>
+      <w:bookmarkStart w:id="23" w:name="_Toc336939623"/>
       <w:r>
         <w:t>Technologies Used</w:t>
       </w:r>
-      <w:bookmarkEnd w:id="26"/>
+      <w:bookmarkEnd w:id="23"/>
     </w:p>
     <w:p>
       <w:pPr>
@@ -6074,11 +6239,11 @@
           <w:numId w:val="11"/>
         </w:numPr>
       </w:pPr>
-      <w:bookmarkStart w:id="27" w:name="_Toc336939624"/>
+      <w:bookmarkStart w:id="24" w:name="_Toc336939624"/>
       <w:r>
         <w:t>Component Overview</w:t>
       </w:r>
-      <w:bookmarkEnd w:id="27"/>
+      <w:bookmarkEnd w:id="24"/>
     </w:p>
     <w:p>
       <w:pPr>
@@ -6088,11 +6253,11 @@
           <w:numId w:val="11"/>
         </w:numPr>
       </w:pPr>
-      <w:bookmarkStart w:id="28" w:name="_Toc336939625"/>
+      <w:bookmarkStart w:id="25" w:name="_Toc336939625"/>
       <w:r>
         <w:t>Phase Overview</w:t>
       </w:r>
-      <w:bookmarkEnd w:id="28"/>
+      <w:bookmarkEnd w:id="25"/>
     </w:p>
     <w:p>
       <w:pPr>
@@ -6102,11 +6267,11 @@
           <w:numId w:val="11"/>
         </w:numPr>
       </w:pPr>
-      <w:bookmarkStart w:id="29" w:name="_Toc336939626"/>
+      <w:bookmarkStart w:id="26" w:name="_Toc336939626"/>
       <w:r>
         <w:t>Architecture Diagram</w:t>
       </w:r>
-      <w:bookmarkEnd w:id="29"/>
+      <w:bookmarkEnd w:id="26"/>
     </w:p>
     <w:p>
       <w:pPr>
@@ -6116,11 +6281,11 @@
           <w:numId w:val="11"/>
         </w:numPr>
       </w:pPr>
-      <w:bookmarkStart w:id="30" w:name="_Toc336939627"/>
+      <w:bookmarkStart w:id="27" w:name="_Toc336939627"/>
       <w:r>
         <w:t>Data or Logic Flow Diagram</w:t>
       </w:r>
-      <w:bookmarkEnd w:id="30"/>
+      <w:bookmarkEnd w:id="27"/>
     </w:p>
     <w:p>
       <w:pPr>
@@ -6130,11 +6295,11 @@
           <w:numId w:val="11"/>
         </w:numPr>
       </w:pPr>
-      <w:bookmarkStart w:id="31" w:name="_Toc336939628"/>
+      <w:bookmarkStart w:id="28" w:name="_Toc336939628"/>
       <w:r>
         <w:t>Design Details</w:t>
       </w:r>
-      <w:bookmarkEnd w:id="31"/>
+      <w:bookmarkEnd w:id="28"/>
     </w:p>
     <w:p>
       <w:pPr>
@@ -6144,11 +6309,11 @@
           <w:numId w:val="11"/>
         </w:numPr>
       </w:pPr>
-      <w:bookmarkStart w:id="32" w:name="_Toc336939629"/>
+      <w:bookmarkStart w:id="29" w:name="_Toc336939629"/>
       <w:r>
         <w:t>Major Component #3</w:t>
       </w:r>
-      <w:bookmarkEnd w:id="32"/>
+      <w:bookmarkEnd w:id="29"/>
     </w:p>
     <w:p>
       <w:pPr>
@@ -6158,11 +6323,11 @@
           <w:numId w:val="11"/>
         </w:numPr>
       </w:pPr>
-      <w:bookmarkStart w:id="33" w:name="_Toc336939630"/>
+      <w:bookmarkStart w:id="30" w:name="_Toc336939630"/>
       <w:r>
         <w:t>Technologies Used</w:t>
       </w:r>
-      <w:bookmarkEnd w:id="33"/>
+      <w:bookmarkEnd w:id="30"/>
     </w:p>
     <w:p>
       <w:pPr>
@@ -6172,11 +6337,11 @@
           <w:numId w:val="11"/>
         </w:numPr>
       </w:pPr>
-      <w:bookmarkStart w:id="34" w:name="_Toc336939631"/>
+      <w:bookmarkStart w:id="31" w:name="_Toc336939631"/>
       <w:r>
         <w:t>Component Overview</w:t>
       </w:r>
-      <w:bookmarkEnd w:id="34"/>
+      <w:bookmarkEnd w:id="31"/>
     </w:p>
     <w:p>
       <w:pPr>
@@ -6186,11 +6351,11 @@
           <w:numId w:val="11"/>
         </w:numPr>
       </w:pPr>
-      <w:bookmarkStart w:id="35" w:name="_Toc336939632"/>
+      <w:bookmarkStart w:id="32" w:name="_Toc336939632"/>
       <w:r>
         <w:t>Phase Overview</w:t>
       </w:r>
-      <w:bookmarkEnd w:id="35"/>
+      <w:bookmarkEnd w:id="32"/>
     </w:p>
     <w:p>
       <w:pPr>
@@ -6200,11 +6365,11 @@
           <w:numId w:val="11"/>
         </w:numPr>
       </w:pPr>
-      <w:bookmarkStart w:id="36" w:name="_Toc336939633"/>
+      <w:bookmarkStart w:id="33" w:name="_Toc336939633"/>
       <w:r>
         <w:t>Architecture Diagram</w:t>
       </w:r>
-      <w:bookmarkEnd w:id="36"/>
+      <w:bookmarkEnd w:id="33"/>
     </w:p>
     <w:p>
       <w:pPr>
@@ -6214,11 +6379,11 @@
           <w:numId w:val="11"/>
         </w:numPr>
       </w:pPr>
-      <w:bookmarkStart w:id="37" w:name="_Toc336939634"/>
+      <w:bookmarkStart w:id="34" w:name="_Toc336939634"/>
       <w:r>
         <w:t>Data Flow Diagram</w:t>
       </w:r>
-      <w:bookmarkEnd w:id="37"/>
+      <w:bookmarkEnd w:id="34"/>
       <w:r>
         <w:t xml:space="preserve"> </w:t>
       </w:r>
@@ -6231,11 +6396,11 @@
           <w:numId w:val="11"/>
         </w:numPr>
       </w:pPr>
-      <w:bookmarkStart w:id="38" w:name="_Toc336939635"/>
+      <w:bookmarkStart w:id="35" w:name="_Toc336939635"/>
       <w:r>
         <w:t>Design Details</w:t>
       </w:r>
-      <w:bookmarkEnd w:id="38"/>
+      <w:bookmarkEnd w:id="35"/>
     </w:p>
     <w:p>
       <w:pPr>
@@ -6245,11 +6410,11 @@
           <w:numId w:val="11"/>
         </w:numPr>
       </w:pPr>
-      <w:bookmarkStart w:id="39" w:name="_Toc336939636"/>
+      <w:bookmarkStart w:id="36" w:name="_Toc336939636"/>
       <w:r>
         <w:t>System and Unit Testing</w:t>
       </w:r>
-      <w:bookmarkEnd w:id="39"/>
+      <w:bookmarkEnd w:id="36"/>
     </w:p>
     <w:p>
       <w:pPr>
@@ -6259,12 +6424,12 @@
           <w:numId w:val="11"/>
         </w:numPr>
       </w:pPr>
-      <w:bookmarkStart w:id="40" w:name="_Toc336939637"/>
+      <w:bookmarkStart w:id="37" w:name="_Toc336939637"/>
       <w:r>
         <w:lastRenderedPageBreak/>
         <w:t>Overview</w:t>
       </w:r>
-      <w:bookmarkEnd w:id="40"/>
+      <w:bookmarkEnd w:id="37"/>
     </w:p>
     <w:p>
       <w:pPr>
@@ -6274,11 +6439,11 @@
           <w:numId w:val="11"/>
         </w:numPr>
       </w:pPr>
-      <w:bookmarkStart w:id="41" w:name="_Toc336939638"/>
+      <w:bookmarkStart w:id="38" w:name="_Toc336939638"/>
       <w:r>
         <w:t>Dependencies</w:t>
       </w:r>
-      <w:bookmarkEnd w:id="41"/>
+      <w:bookmarkEnd w:id="38"/>
     </w:p>
     <w:p>
       <w:pPr>
@@ -6288,11 +6453,11 @@
           <w:numId w:val="11"/>
         </w:numPr>
       </w:pPr>
-      <w:bookmarkStart w:id="42" w:name="_Toc336939639"/>
+      <w:bookmarkStart w:id="39" w:name="_Toc336939639"/>
       <w:r>
         <w:t>Test Setup and Execution</w:t>
       </w:r>
-      <w:bookmarkEnd w:id="42"/>
+      <w:bookmarkEnd w:id="39"/>
     </w:p>
     <w:p>
       <w:pPr>
@@ -6302,11 +6467,11 @@
           <w:numId w:val="11"/>
         </w:numPr>
       </w:pPr>
-      <w:bookmarkStart w:id="43" w:name="_Toc336939640"/>
+      <w:bookmarkStart w:id="40" w:name="_Toc336939640"/>
       <w:r>
         <w:t>Development Environment</w:t>
       </w:r>
-      <w:bookmarkEnd w:id="43"/>
+      <w:bookmarkEnd w:id="40"/>
     </w:p>
     <w:p>
       <w:pPr>
@@ -6316,11 +6481,11 @@
           <w:numId w:val="11"/>
         </w:numPr>
       </w:pPr>
-      <w:bookmarkStart w:id="44" w:name="_Toc336939641"/>
+      <w:bookmarkStart w:id="41" w:name="_Toc336939641"/>
       <w:r>
         <w:t>Development IDE and Tools</w:t>
       </w:r>
-      <w:bookmarkEnd w:id="44"/>
+      <w:bookmarkEnd w:id="41"/>
     </w:p>
     <w:p>
       <w:pPr>
@@ -6330,11 +6495,11 @@
           <w:numId w:val="11"/>
         </w:numPr>
       </w:pPr>
-      <w:bookmarkStart w:id="45" w:name="_Toc336939642"/>
+      <w:bookmarkStart w:id="42" w:name="_Toc336939642"/>
       <w:r>
         <w:t>Source Control</w:t>
       </w:r>
-      <w:bookmarkEnd w:id="45"/>
+      <w:bookmarkEnd w:id="42"/>
     </w:p>
     <w:p>
       <w:pPr>
@@ -6344,11 +6509,11 @@
           <w:numId w:val="11"/>
         </w:numPr>
       </w:pPr>
-      <w:bookmarkStart w:id="46" w:name="_Toc336939643"/>
+      <w:bookmarkStart w:id="43" w:name="_Toc336939643"/>
       <w:r>
         <w:t>Dependencies</w:t>
       </w:r>
-      <w:bookmarkEnd w:id="46"/>
+      <w:bookmarkEnd w:id="43"/>
     </w:p>
     <w:p>
       <w:pPr>
@@ -6358,11 +6523,11 @@
           <w:numId w:val="11"/>
         </w:numPr>
       </w:pPr>
-      <w:bookmarkStart w:id="47" w:name="_Toc336939644"/>
+      <w:bookmarkStart w:id="44" w:name="_Toc336939644"/>
       <w:r>
         <w:t>Build Environment</w:t>
       </w:r>
-      <w:bookmarkEnd w:id="47"/>
+      <w:bookmarkEnd w:id="44"/>
     </w:p>
     <w:p>
       <w:pPr>
@@ -6372,11 +6537,11 @@
           <w:numId w:val="11"/>
         </w:numPr>
       </w:pPr>
-      <w:bookmarkStart w:id="48" w:name="_Toc336939645"/>
+      <w:bookmarkStart w:id="45" w:name="_Toc336939645"/>
       <w:r>
         <w:t>Development Machine Setup</w:t>
       </w:r>
-      <w:bookmarkEnd w:id="48"/>
+      <w:bookmarkEnd w:id="45"/>
     </w:p>
     <w:p>
       <w:pPr>
@@ -6386,11 +6551,11 @@
           <w:numId w:val="11"/>
         </w:numPr>
       </w:pPr>
-      <w:bookmarkStart w:id="49" w:name="_Toc336939646"/>
+      <w:bookmarkStart w:id="46" w:name="_Toc336939646"/>
       <w:r>
         <w:t>Release | Setup | Deployment</w:t>
       </w:r>
-      <w:bookmarkEnd w:id="49"/>
+      <w:bookmarkEnd w:id="46"/>
     </w:p>
     <w:p>
       <w:pPr>
@@ -6400,11 +6565,11 @@
           <w:numId w:val="11"/>
         </w:numPr>
       </w:pPr>
-      <w:bookmarkStart w:id="50" w:name="_Toc336939647"/>
+      <w:bookmarkStart w:id="47" w:name="_Toc336939647"/>
       <w:r>
         <w:t>Deployment Information and Dependencies</w:t>
       </w:r>
-      <w:bookmarkEnd w:id="50"/>
+      <w:bookmarkEnd w:id="47"/>
     </w:p>
     <w:p>
       <w:pPr>
@@ -6414,11 +6579,11 @@
           <w:numId w:val="11"/>
         </w:numPr>
       </w:pPr>
-      <w:bookmarkStart w:id="51" w:name="_Toc336939648"/>
+      <w:bookmarkStart w:id="48" w:name="_Toc336939648"/>
       <w:r>
         <w:t>Setup Information</w:t>
       </w:r>
-      <w:bookmarkEnd w:id="51"/>
+      <w:bookmarkEnd w:id="48"/>
     </w:p>
     <w:p>
       <w:pPr>
@@ -6428,11 +6593,11 @@
           <w:numId w:val="11"/>
         </w:numPr>
       </w:pPr>
-      <w:bookmarkStart w:id="52" w:name="_Toc336939649"/>
+      <w:bookmarkStart w:id="49" w:name="_Toc336939649"/>
       <w:r>
         <w:t>System Versioning Information</w:t>
       </w:r>
-      <w:bookmarkEnd w:id="52"/>
+      <w:bookmarkEnd w:id="49"/>
     </w:p>
     <w:p>
       <w:pPr>
@@ -6442,67 +6607,67 @@
           <w:numId w:val="11"/>
         </w:numPr>
       </w:pPr>
-      <w:bookmarkStart w:id="53" w:name="_Toc336939650"/>
+      <w:bookmarkStart w:id="50" w:name="_Toc336939650"/>
       <w:r>
         <w:t>End User Documentation</w:t>
       </w:r>
+      <w:bookmarkEnd w:id="50"/>
+    </w:p>
+    <w:p/>
+    <w:p>
+      <w:pPr>
+        <w:pStyle w:val="Heading1"/>
+      </w:pPr>
+      <w:bookmarkStart w:id="51" w:name="_Toc336939651"/>
+      <w:r>
+        <w:t>Appendix I: List of Figures</w:t>
+      </w:r>
+      <w:bookmarkEnd w:id="51"/>
+    </w:p>
+    <w:p/>
+    <w:p>
+      <w:pPr>
+        <w:pStyle w:val="Heading1"/>
+      </w:pPr>
+      <w:bookmarkStart w:id="52" w:name="_Toc336939652"/>
+      <w:r>
+        <w:t>Appendix II: Supporting Information and Details</w:t>
+      </w:r>
+      <w:bookmarkEnd w:id="52"/>
+    </w:p>
+    <w:p>
+      <w:pPr>
+        <w:pStyle w:val="Heading1"/>
+      </w:pPr>
+      <w:bookmarkStart w:id="53" w:name="_Toc336939653"/>
+      <w:r>
+        <w:t>Appendix III: Progress | Sprint Reports</w:t>
+      </w:r>
       <w:bookmarkEnd w:id="53"/>
     </w:p>
-    <w:p/>
-    <w:p>
-      <w:pPr>
-        <w:pStyle w:val="Heading1"/>
-      </w:pPr>
-      <w:bookmarkStart w:id="54" w:name="_Toc336939651"/>
-      <w:r>
-        <w:t>Appendix I: List of Figures</w:t>
+    <w:p>
+      <w:pPr>
+        <w:pStyle w:val="Heading2"/>
+      </w:pPr>
+      <w:r>
+        <w:tab/>
+      </w:r>
+      <w:bookmarkStart w:id="54" w:name="_Toc336939654"/>
+      <w:r>
+        <w:t>III.1 Sprint 1 Progress Report</w:t>
       </w:r>
       <w:bookmarkEnd w:id="54"/>
-    </w:p>
-    <w:p/>
-    <w:p>
-      <w:pPr>
-        <w:pStyle w:val="Heading1"/>
-      </w:pPr>
-      <w:bookmarkStart w:id="55" w:name="_Toc336939652"/>
-      <w:r>
-        <w:t>Appendix II: Supporting Information and Details</w:t>
-      </w:r>
-      <w:bookmarkEnd w:id="55"/>
-    </w:p>
-    <w:p>
-      <w:pPr>
-        <w:pStyle w:val="Heading1"/>
-      </w:pPr>
-      <w:bookmarkStart w:id="56" w:name="_Toc336939653"/>
-      <w:r>
-        <w:t>Appendix III: Progress | Sprint Reports</w:t>
-      </w:r>
-      <w:bookmarkEnd w:id="56"/>
-    </w:p>
-    <w:p>
-      <w:pPr>
-        <w:pStyle w:val="Heading2"/>
-      </w:pPr>
-      <w:r>
-        <w:tab/>
-      </w:r>
-      <w:bookmarkStart w:id="57" w:name="_Toc336939654"/>
-      <w:r>
-        <w:t>III.1 Sprint 1 Progress Report</w:t>
-      </w:r>
-      <w:bookmarkEnd w:id="57"/>
     </w:p>
     <w:p>
       <w:pPr>
         <w:pStyle w:val="Heading2"/>
         <w:ind w:firstLine="720"/>
       </w:pPr>
-      <w:bookmarkStart w:id="58" w:name="_Toc336939655"/>
+      <w:bookmarkStart w:id="55" w:name="_Toc336939655"/>
       <w:r>
         <w:t>III.2 Sprint 2 Progress Report</w:t>
       </w:r>
-      <w:bookmarkEnd w:id="58"/>
+      <w:bookmarkEnd w:id="55"/>
     </w:p>
     <w:sectPr>
       <w:pgSz w:w="12240" w:h="15840"/>
@@ -8377,6 +8542,30 @@
       <w:rFonts w:asciiTheme="majorHAnsi" w:eastAsiaTheme="majorEastAsia" w:hAnsiTheme="majorHAnsi" w:cstheme="majorBidi"/>
       <w:b/>
       <w:bCs/>
+      <w:color w:val="4F81BD" w:themeColor="accent1"/>
+    </w:rPr>
+  </w:style>
+  <w:style w:type="paragraph" w:styleId="Heading4">
+    <w:name w:val="heading 4"/>
+    <w:basedOn w:val="Normal"/>
+    <w:next w:val="Normal"/>
+    <w:link w:val="Heading4Char"/>
+    <w:uiPriority w:val="9"/>
+    <w:unhideWhenUsed/>
+    <w:qFormat/>
+    <w:rsid w:val="00DB2424"/>
+    <w:pPr>
+      <w:keepNext/>
+      <w:keepLines/>
+      <w:spacing w:before="200" w:after="0"/>
+      <w:outlineLvl w:val="3"/>
+    </w:pPr>
+    <w:rPr>
+      <w:rFonts w:asciiTheme="majorHAnsi" w:eastAsiaTheme="majorEastAsia" w:hAnsiTheme="majorHAnsi" w:cstheme="majorBidi"/>
+      <w:b/>
+      <w:bCs/>
+      <w:i/>
+      <w:iCs/>
       <w:color w:val="4F81BD" w:themeColor="accent1"/>
     </w:rPr>
   </w:style>
@@ -8785,6 +8974,21 @@
       </w:tcPr>
     </w:tblStylePr>
   </w:style>
+  <w:style w:type="character" w:customStyle="1" w:styleId="Heading4Char">
+    <w:name w:val="Heading 4 Char"/>
+    <w:basedOn w:val="DefaultParagraphFont"/>
+    <w:link w:val="Heading4"/>
+    <w:uiPriority w:val="9"/>
+    <w:rsid w:val="00DB2424"/>
+    <w:rPr>
+      <w:rFonts w:asciiTheme="majorHAnsi" w:eastAsiaTheme="majorEastAsia" w:hAnsiTheme="majorHAnsi" w:cstheme="majorBidi"/>
+      <w:b/>
+      <w:bCs/>
+      <w:i/>
+      <w:iCs/>
+      <w:color w:val="4F81BD" w:themeColor="accent1"/>
+    </w:rPr>
+  </w:style>
 </w:styles>
 </file>
 
@@ -9014,6 +9218,30 @@
       <w:rFonts w:asciiTheme="majorHAnsi" w:eastAsiaTheme="majorEastAsia" w:hAnsiTheme="majorHAnsi" w:cstheme="majorBidi"/>
       <w:b/>
       <w:bCs/>
+      <w:color w:val="4F81BD" w:themeColor="accent1"/>
+    </w:rPr>
+  </w:style>
+  <w:style w:type="paragraph" w:styleId="Heading4">
+    <w:name w:val="heading 4"/>
+    <w:basedOn w:val="Normal"/>
+    <w:next w:val="Normal"/>
+    <w:link w:val="Heading4Char"/>
+    <w:uiPriority w:val="9"/>
+    <w:unhideWhenUsed/>
+    <w:qFormat/>
+    <w:rsid w:val="00DB2424"/>
+    <w:pPr>
+      <w:keepNext/>
+      <w:keepLines/>
+      <w:spacing w:before="200" w:after="0"/>
+      <w:outlineLvl w:val="3"/>
+    </w:pPr>
+    <w:rPr>
+      <w:rFonts w:asciiTheme="majorHAnsi" w:eastAsiaTheme="majorEastAsia" w:hAnsiTheme="majorHAnsi" w:cstheme="majorBidi"/>
+      <w:b/>
+      <w:bCs/>
+      <w:i/>
+      <w:iCs/>
       <w:color w:val="4F81BD" w:themeColor="accent1"/>
     </w:rPr>
   </w:style>
@@ -9422,6 +9650,21 @@
       </w:tcPr>
     </w:tblStylePr>
   </w:style>
+  <w:style w:type="character" w:customStyle="1" w:styleId="Heading4Char">
+    <w:name w:val="Heading 4 Char"/>
+    <w:basedOn w:val="DefaultParagraphFont"/>
+    <w:link w:val="Heading4"/>
+    <w:uiPriority w:val="9"/>
+    <w:rsid w:val="00DB2424"/>
+    <w:rPr>
+      <w:rFonts w:asciiTheme="majorHAnsi" w:eastAsiaTheme="majorEastAsia" w:hAnsiTheme="majorHAnsi" w:cstheme="majorBidi"/>
+      <w:b/>
+      <w:bCs/>
+      <w:i/>
+      <w:iCs/>
+      <w:color w:val="4F81BD" w:themeColor="accent1"/>
+    </w:rPr>
+  </w:style>
 </w:styles>
 </file>
 
@@ -9715,7 +9958,7 @@
 </file>
 
 <file path=customXml/itemProps1.xml><?xml version="1.0" encoding="utf-8"?>
-<ds:datastoreItem xmlns:ds="http://schemas.openxmlformats.org/officeDocument/2006/customXml" ds:itemID="{35D10968-28AB-41A9-955B-AC319C271160}">
+<ds:datastoreItem xmlns:ds="http://schemas.openxmlformats.org/officeDocument/2006/customXml" ds:itemID="{A79D00E8-0B2A-4682-AE45-D1544C5D58D4}">
   <ds:schemaRefs>
     <ds:schemaRef ds:uri="http://schemas.openxmlformats.org/officeDocument/2006/bibliography"/>
   </ds:schemaRefs>

</xml_diff>